<commit_message>
Week 7 rubric: score what the handoff PDF actually contains
Rendered the Studio's handoff for a fictional student and read it against
the rubric. Two mismatches, both the rubric's fault.

Row 1 asked for "the student(s) whose work you're drawing on." The Studio
has no field for that and buildPrintDoc never emits it, so no student could
satisfy the clause however carefully they worked. Cut. The focus students
were named and graded in Week 6, and the Planner's own Concept Profile tab
is what carries them to the AI.

Row 1 also ignored two things the PDF does carry -- the teaching methods
and how they plan to engage students in the concept. Now scored, and the
row is renamed for what it covers.

Row 3 is "The question storm," which is what Document 1 calls that section,
and "plentiful" now has a number: at least six, named as a floor so nobody
reads it as the target.

Co-Authored-By: Claude Opus 5 (1M context) <noreply@anthropic.com>
</commit_message>
<xml_diff>
--- a/week-7-research-questions/week-7-research-question.docx
+++ b/week-7-research-questions/week-7-research-question.docx
@@ -203,7 +203,7 @@
               <w:rPr>
                 <w:b/>
               </w:rPr>
-              <w:t>Concept description (5)</w:t>
+              <w:t>The concept and your approach (5)</w:t>
             </w:r>
           </w:p>
         </w:tc>
@@ -213,7 +213,7 @@
           </w:tcPr>
           <w:p>
             <w:r>
-              <w:t>In your handoff PDF: the concept you're investigating, the grade and the mathematics ahead, and the student(s) whose work you're drawing on — specific and evidence-based, not generic.</w:t>
+              <w:t>In your handoff PDF: the concept you’re investigating, the grade, the mathematics ahead, and how you’re thinking of engaging students in it — specific and evidence-based, not generic.</w:t>
             </w:r>
           </w:p>
         </w:tc>
@@ -253,7 +253,7 @@
               <w:rPr>
                 <w:b/>
               </w:rPr>
-              <w:t>The brainstorm (5)</w:t>
+              <w:t>The question storm (5)</w:t>
             </w:r>
           </w:p>
         </w:tc>
@@ -263,7 +263,7 @@
           </w:tcPr>
           <w:p>
             <w:r>
-              <w:t>A real question storm — open, deep, and plentiful — with each question marked open or closed, and aimed at how students understand the concept.</w:t>
+              <w:t>At least six questions, each marked open or closed, and aimed at how students understand the concept rather than at one child. Six is the floor, not the target — the rules exist to push you past your first three.</w:t>
             </w:r>
           </w:p>
         </w:tc>

</xml_diff>

<commit_message>
Week 7 assignment: say how each document is made, and revisit 2c
Document 1: Check names, then Hand off -> Produce PDF -> Save as PDF.
Document 2: written by the student, about a page, saved as PDF. Step 2
now revisits the Concept Profile question in 2c. Due Sun 10/11 11:59 pm.

Co-Authored-By: Claude Opus 5.5 <noreply@anthropic.com>
</commit_message>
<xml_diff>
--- a/week-7-research-questions/week-7-research-question.docx
+++ b/week-7-research-questions/week-7-research-question.docx
@@ -70,7 +70,7 @@
         <w:pStyle w:val="ListNumber"/>
       </w:pPr>
       <w:r>
-        <w:t>Sharpen with the genAI planning partner. Put the questions you are weighing into the BDA Planner — Concept Profile → Concept &amp; question → 2c — and press Check this. There is nothing to upload: it already has your concept and the work you collected. It will widen your questions and pressure-test them — is this open? investigable? about how students reason about the concept, not just whether they got the answer right? Keep authorship: if it tries to write your question, push back.</w:t>
+        <w:t>Sharpen with the genAI planning partner. Open the BDA Planner and go back to the question you wrote for your Concept Profile: Concept Profile → Concept &amp; question → 2c. Revisit it: revise it or replace it, using your question storm and our class discussion of what makes a research question better. Then press Check this. It will widen your questions and pressure-test them — is this open? investigable? about how students reason about the concept, not just whether they got the answer right? Keep authorship: if it tries to write your question, push back.</w:t>
       </w:r>
     </w:p>
     <w:p>
@@ -86,7 +86,7 @@
         <w:pStyle w:val="ListNumber"/>
       </w:pPr>
       <w:r>
-        <w:t>Assemble Document 2 — your sharpening record: two or three moments from the exchange that genuinely moved your question forward, each described in your own words with what it contributed, plus your landed question and your reasoning.</w:t>
+        <w:t>Write Document 2 — your sharpening record. Write it yourself in Word or Google Docs, about one page: two or three moments from your exchanges with the genAI planning partner that genuinely moved your question forward, each described in your own words with what it contributed, plus your landed question and your reasoning. Save it as a PDF.</w:t>
       </w:r>
     </w:p>
     <w:p>
@@ -102,7 +102,7 @@
         <w:pStyle w:val="ListBullet"/>
       </w:pPr>
       <w:r>
-        <w:t>Document 1 — the Studio handoff PDF: your concept, your reading of the work you collected, and your question storm. The work itself stays attached to your Concept Profile; you do not upload it again.</w:t>
+        <w:t>Document 1 — the Studio handoff PDF. In the Research Question Studio, confirm the snapshot on step 4 (Check names), then on step 5 (Hand off) press Produce PDF and choose Save as PDF. It holds your concept, your reading of the work you collected, and your question storm. The work itself stays attached to your Concept Profile; you do not upload it again.</w:t>
       </w:r>
     </w:p>
     <w:p>
@@ -110,7 +110,7 @@
         <w:pStyle w:val="ListBullet"/>
       </w:pPr>
       <w:r>
-        <w:t>Document 2 — your sharpening record: a short account (in your own words) of the exchanges that moved your question forward + the landed question + why (about one page).</w:t>
+        <w:t>Document 2 — your sharpening record, written by you (about one page) and saved as a PDF: the exchanges that moved your question forward, the landed question, and why.</w:t>
       </w:r>
     </w:p>
     <w:p>
@@ -126,7 +126,7 @@
         <w:pStyle w:val="ListBullet"/>
       </w:pPr>
       <w:r>
-        <w:t>Submit both in Canvas.</w:t>
+        <w:t>Submit both PDFs in Canvas by Sunday, October 11, 11:59 pm.</w:t>
       </w:r>
     </w:p>
     <w:p>

</xml_diff>

<commit_message>
Week 7 handout: Document 2 is two things, not a list of three
It read as three because it was written as three -- the moments, the landed
question, and the reasoning -- when the reasoning belongs to the question and
the rubric already scores them as one row. Two things now, matching the two
rows that score them: your question and why you chose that one, and the two or
three moments that moved it. Same for the format section.

Co-Authored-By: Claude Opus 5 (1M context) <noreply@anthropic.com>
</commit_message>
<xml_diff>
--- a/week-7-research-questions/week-7-research-question.docx
+++ b/week-7-research-questions/week-7-research-question.docx
@@ -86,7 +86,7 @@
         <w:pStyle w:val="ListNumber"/>
       </w:pPr>
       <w:r>
-        <w:t>Write Document 2 — your sharpening record. Write it yourself in Word or Google Docs, about one page: two or three moments from your exchanges with the genAI planning partner that genuinely moved your question forward, each described in your own words with what it contributed, plus your landed question and your reasoning. Save it as a PDF.</w:t>
+        <w:t>Write Document 2 — your sharpening record. One page, written by you in Word or Google Docs and saved as a PDF. Two things, in either order: your question and why you chose that one; and two or three moments where the planning partner pushed it forward, each in your own words.</w:t>
       </w:r>
     </w:p>
     <w:p>
@@ -110,7 +110,7 @@
         <w:pStyle w:val="ListBullet"/>
       </w:pPr>
       <w:r>
-        <w:t>Document 2 — your sharpening record, written by you (about one page) and saved as a PDF: the exchanges that moved your question forward, the landed question, and why.</w:t>
+        <w:t>Document 2 — your sharpening record: one page, written by you, saved as a PDF. Your question and why, and the two or three moments that moved it.</w:t>
       </w:r>
     </w:p>
     <w:p>

</xml_diff>

<commit_message>
Week 7: the question storm floor is five, in the app and the rubric
Q_MIN was introduced at ten yesterday when the storm-before-sorting gate
was built, and the handout was then changed from six to ten to match it.
Todd's call: five is the right floor for a first QFT in a 25-minute block.

Changed everywhere the number lives: Q_MIN and the gate tooltip, the Day 2
outline's Brainstorm bullet, the handout's "asks for ten before it will let
you go on", and the rubric row "The question storm (5)".

The rubric's closing clause was "the rules exist to push you past your first
three", which has no force once the floor is five; it now reads "past the
obvious ones", echoing the handout's own phrase a few paragraphs earlier.

Verified in headless: counter reads "n of 5", Done stays disabled to four,
enables at five, and flips the tab to the sorting phase.

Co-Authored-By: Claude Opus 5 (1M context) <noreply@anthropic.com>
</commit_message>
<xml_diff>
--- a/week-7-research-questions/week-7-research-question.docx
+++ b/week-7-research-questions/week-7-research-question.docx
@@ -62,7 +62,7 @@
         <w:pStyle w:val="ListNumber"/>
       </w:pPr>
       <w:r>
-        <w:t>Run the QFT in the Studio. In the Research Question Studio, press “Bring in my Concept Profile” on the first tab — your grade, your concept and one slot for each piece of work you collected come across from the BDA Planner. Then describe the work you collected: for each sample, what the task asked for, what the work shows, and what it makes you wonder about students’ understanding. You do not upload the work again — it is already attached to your Concept Profile, and it was graded there. What is graded here is how closely you read it. Then, using the four rules, storm as many questions about how students understand that concept as you can — the Studio asks for ten before it will let you go on, because the ones worth having usually arrive after the obvious ones. Only then does it ask you to mark each one open or closed: while you are storming there is nothing on the screen to judge with, which is rule 2. Then produce the handoff PDF. (This PDF is Document 1.)</w:t>
+        <w:t>Run the QFT in the Studio. In the Research Question Studio, press “Bring in my Concept Profile” on the first tab — your grade, your concept and one slot for each piece of work you collected come across from the BDA Planner. Then describe the work you collected: for each sample, what the task asked for, what the work shows, and what it makes you wonder about students’ understanding. You do not upload the work again — it is already attached to your Concept Profile, and it was graded there. What is graded here is how closely you read it. Then, using the four rules, storm as many questions about how students understand that concept as you can — the Studio asks for five before it will let you go on, because the ones worth having usually arrive after the obvious ones. Only then does it ask you to mark each one open or closed: while you are storming there is nothing on the screen to judge with, which is rule 2. Then produce the handoff PDF. (This PDF is Document 1.)</w:t>
       </w:r>
     </w:p>
     <w:p>
@@ -263,7 +263,7 @@
           </w:tcPr>
           <w:p>
             <w:r>
-              <w:t>At least ten questions, each marked open or closed, and aimed at how students understand the concept rather than at one child. Ten is the floor, not the target — the rules exist to push you past your first three.</w:t>
+              <w:t>At least five questions, each marked open or closed, and aimed at how students understand the concept rather than at one child. Five is the floor, not the target — the rules exist to push you past the obvious ones.</w:t>
             </w:r>
           </w:p>
         </w:tc>

</xml_diff>

<commit_message>
Week 7: Research Question rubric revised in students' favor
Concept row no longer docks a missing engagement plan; Reading the work
covers every sample collected; open/closed marks are not argued; genAI and
research-question rows drop the stricter phrasing. No score can go down.

Co-Authored-By: Claude Opus 5.5 <noreply@anthropic.com>
</commit_message>
<xml_diff>
--- a/week-7-research-questions/week-7-research-question.docx
+++ b/week-7-research-questions/week-7-research-question.docx
@@ -213,7 +213,7 @@
           </w:tcPr>
           <w:p>
             <w:r>
-              <w:t>In your handoff PDF: the concept you’re investigating, the grade, the mathematics ahead, and how you’re thinking of engaging students in it — specific and evidence-based, not generic.</w:t>
+              <w:t xml:space="preserve">The concept and grade are clear in the handoff PDF, and the reading of the work shows what mathematics is involved. Credit for saying how you’d engage students, but no deduction if it’s missing.</w:t>
             </w:r>
           </w:p>
         </w:tc>
@@ -238,7 +238,7 @@
           </w:tcPr>
           <w:p>
             <w:r>
-              <w:t>For each of three to five samples from your Concept Profile: what the task asked for and what the work shows (2), and what it makes you wonder about students’ understanding (3). Description, not diagnosis — the wondering is where most of these points live.</w:t>
+              <w:t xml:space="preserve">For each sample you collected: what the task asked for and what the work shows (2), and what it makes you wonder about students’ understanding (3). Description, not diagnosis.</w:t>
             </w:r>
           </w:p>
         </w:tc>
@@ -263,7 +263,7 @@
           </w:tcPr>
           <w:p>
             <w:r>
-              <w:t>At least five questions, each marked open or closed, and aimed at how students understand the concept rather than at one child. Five is the floor, not the target — the rules exist to push you past the obvious ones.</w:t>
+              <w:t xml:space="preserve">At least five questions, each marked open or closed, mostly about how students understand the concept. Open/closed is a judgment call, so I won’t argue your marks.</w:t>
             </w:r>
           </w:p>
         </w:tc>
@@ -288,7 +288,7 @@
           </w:tcPr>
           <w:p>
             <w:r>
-              <w:t>In your sharpening record: two or three moments from the exchange that genuinely moved your question forward, each described in your own words with what it contributed — a real dialogue, not a one-shot.</w:t>
+              <w:t xml:space="preserve">Two or three specific moments, in your own words, where the exchange moved your question forward.</w:t>
             </w:r>
           </w:p>
         </w:tc>
@@ -313,7 +313,7 @@
           </w:tcPr>
           <w:p>
             <w:r>
-              <w:t>One question that is open, about how students understand the concept, grounded in the collected work, and answerable by the evidence one nested lesson could produce — plus a line on why this one.</w:t>
+              <w:t xml:space="preserve">One question that’s open, about how students understand the concept, grounded in the collected work, and answerable with one nested lesson, plus a line on why you picked it.</w:t>
             </w:r>
           </w:p>
         </w:tc>

</xml_diff>